<commit_message>
refactor: prune scratch directory and add streamlined integration and utility scripts
</commit_message>
<xml_diff>
--- a/Bölüm dersleri promptu.docx
+++ b/Bölüm dersleri promptu.docx
@@ -646,6 +646,100 @@
       </w:r>
     </w:p>
     <w:p/>
+    <w:p/>
+    <w:p>
+      <w:r>
+        <w:rPr>
+          <w:b/>
+          <w:color w:val="FF0000"/>
+        </w:rPr>
+        <w:t>7. Yeni İnteraktif Soru Tipleri (Hata Avcısı, Edat Mıknatısı, Bağlantı Kilidi, Refleks Blitz) Kuralları:</w:t>
+      </w:r>
+    </w:p>
+    <w:p>
+      <w:r>
+        <w:rPr>
+          <w:color w:val="FF0000"/>
+        </w:rPr>
+        <w:t xml:space="preserve">- </w:t>
+      </w:r>
+      <w:r>
+        <w:rPr>
+          <w:b/>
+          <w:color w:val="FF0000"/>
+        </w:rPr>
+        <w:t>Hata Avcısı / Debugger (Swipe Mode - 'swipe'):</w:t>
+      </w:r>
+      <w:r>
+        <w:rPr>
+          <w:color w:val="FF0000"/>
+        </w:rPr>
+        <w:t xml:space="preserve"> Tinder tarzı kart kaydırma mantığıyla çalışır. Öğrenci kartı sola kaydırırsa yapıyı "BUG" (hatalı edat kullanımı), sağa kaydırırsa "VALID" (doğru edat kullanımı) olarak sınıflandırır. Hızlı tepki süresi ölçmek için kartın üzerinde 3 saniyelik bir geri sayım barı yer alır. Süre biterse otomatik olarak yanlış kabul edilerek kontrol paneline geçilir.</w:t>
+      </w:r>
+    </w:p>
+    <w:p>
+      <w:r>
+        <w:rPr>
+          <w:color w:val="FF0000"/>
+        </w:rPr>
+        <w:t xml:space="preserve">- </w:t>
+      </w:r>
+      <w:r>
+        <w:rPr>
+          <w:b/>
+          <w:color w:val="FF0000"/>
+        </w:rPr>
+        <w:t>Edat Mıknatısı (Preposition Magnet - 'preposition-magnet'):</w:t>
+      </w:r>
+      <w:r>
+        <w:rPr>
+          <w:color w:val="FF0000"/>
+        </w:rPr>
+        <w:t xml:space="preserve"> Boşluklu bir cümlede, cümlenin altındaki edat butonlarının sürüklenerek boşluğa bırakılması (drag-and-drop) esasına dayanır. Sürüklenen edat boşluğa yaklaştırıldığında boşluk parlar. Eğer doğru edat bırakılırsa boşluğa yerleşir ve kontrol edilir; yanlış edat bırakılırsa edat kartı sallanır (shake) ve geri teperek (rebound) başlangıç pozisyonuna geri döner.</w:t>
+      </w:r>
+    </w:p>
+    <w:p>
+      <w:r>
+        <w:rPr>
+          <w:color w:val="FF0000"/>
+        </w:rPr>
+        <w:t xml:space="preserve">- </w:t>
+      </w:r>
+      <w:r>
+        <w:rPr>
+          <w:b/>
+          <w:color w:val="FF0000"/>
+        </w:rPr>
+        <w:t>Bağlantı Kilidi (Collocation Matcher - 'collocation-matching'):</w:t>
+      </w:r>
+      <w:r>
+        <w:rPr>
+          <w:color w:val="FF0000"/>
+        </w:rPr>
+        <w:t xml:space="preserve"> Karışık yerleştirilmiş 8 karttan oluşan bir eşleştirme oyunudur (4 sıfat/fiil ve 4 edat). Öğrenci doğru kelime ve edat kartını ardı ardına seçtiğinde kartlar yeşile dönerek küçülür ve solar. Yanlış eşleştirmelerde kartlar kırmızı renkle titrer ve seçimler sıfırlanır. Tüm çiftler eşleştiğinde alıştırma tamamlanır.</w:t>
+      </w:r>
+    </w:p>
+    <w:p>
+      <w:r>
+        <w:rPr>
+          <w:color w:val="FF0000"/>
+        </w:rPr>
+        <w:t xml:space="preserve">- </w:t>
+      </w:r>
+      <w:r>
+        <w:rPr>
+          <w:b/>
+          <w:color w:val="FF0000"/>
+        </w:rPr>
+        <w:t>Refleks Blitz (Hız Tüneli - 'reflex-blitz'):</w:t>
+      </w:r>
+      <w:r>
+        <w:rPr>
+          <w:color w:val="FF0000"/>
+        </w:rPr>
+        <w:t xml:space="preserve"> Hızlı karar vermeyi ölçen çoktan seçmeli bir alıştırmadır. Cümlenin altında büyük seçenek butonları yer alır. 1 ve 2 tuşları ile klavye kısayolu desteklenir. Alıştırma başında 3 saniyelik çok hızlı bir süre barı geri sayar. Üst üste doğru cevaplar combo streak oluşturur. Combo streak 3 ve üzerine çıktığında arayüzün etrafında alev efekti (pulsing neon glow) tetiklenir.</w:t>
+      </w:r>
+    </w:p>
     <w:p/>
     <w:p>
       <w:r>

</xml_diff>

<commit_message>
docs: add question design guidelines to Bölüm dersleri promptu.docx in green
</commit_message>
<xml_diff>
--- a/Bölüm dersleri promptu.docx
+++ b/Bölüm dersleri promptu.docx
@@ -1303,6 +1303,48 @@
     <w:p/>
     <w:p/>
     <w:p/>
+    <w:p>
+      <w:r>
+        <w:rPr>
+          <w:b/>
+          <w:color w:val="2E7559"/>
+        </w:rPr>
+        <w:br/>
+        <w:t>### 6. Soru Hazırlarken Dikkat Edilmesi Gereken Katı Kurallar (Best Practices)</w:t>
+      </w:r>
+    </w:p>
+    <w:p>
+      <w:r>
+        <w:rPr>
+          <w:color w:val="2E7559"/>
+        </w:rPr>
+        <w:t>1. Tematik Çeşitlilik (Theme Carousel): Bir derste arka arkaya gelen soruların bağlamı farklı olmalıdır. (Örn: 1. soru yazılım/server ise, 2. soru tarih/arkeoloji, 3. soru tıp/biyoloji, 4. soru günlük diyalog olmalıdır.)</w:t>
+      </w:r>
+    </w:p>
+    <w:p>
+      <w:r>
+        <w:rPr>
+          <w:color w:val="2E7559"/>
+        </w:rPr>
+        <w:t>2. ID Benzersizliği (Unique IDs): Her sorunun ID'si (c40_l1_e1_q1 vb.) global olarak benzersiz olmalıdır. Copy-paste edilerek çoğaltılan sorularda ID'ler çakışırsa frontend motoru aynı soruyu render etmeye devam eder.</w:t>
+      </w:r>
+    </w:p>
+    <w:p>
+      <w:r>
+        <w:rPr>
+          <w:color w:val="2E7559"/>
+        </w:rPr>
+        <w:t>3. Miktar Sınırı (Sparsity Rule): Tek bir ders altındaki toplam soru sayısı ideali 10-15 arasındadır. Daha fazla pratik gerekiyorsa bu sorular ayrı derslere veya karma testlere bölünmelidir.</w:t>
+      </w:r>
+    </w:p>
+    <w:p>
+      <w:r>
+        <w:rPr>
+          <w:color w:val="2E7559"/>
+        </w:rPr>
+        <w:t>4. Şablon Varyasyonu: Cümle dizilimlerinde sadece kelimeleri değiştirip yapıyı sabit tutmaktan kaçınılmalıdır. Cümle bazen zaman bağlacıyla başlamalı, bazen ana cümleyle başlamalı, bazen araya zarflar girmelidir.</w:t>
+      </w:r>
+    </w:p>
     <w:sectPr>
       <w:pgSz w:w="12240" w:h="15840"/>
       <w:pgMar w:top="1417" w:right="1417" w:bottom="1417" w:left="1417" w:header="720" w:footer="720" w:gutter="0"/>

</xml_diff>